<commit_message>
Add references and AI use disclosure to Charity 5K model answer
Cites PMI (2017), Microsoft Support and Government of Ontario sources
in APA style, and adds an accurate AI use disclosure stating the
material was AI-generated practice content, not a student's own work.

Co-Authored-By: Claude Opus 5.5 <noreply@anthropic.com>
Claude-Session: https://claude.ai/code/session_01GC36R8bajH5DkQoo6K8PwR
</commit_message>
<xml_diff>
--- a/MGMT 6128/Midterm Practice/Charity 5K - Model Answer.docx
+++ b/MGMT 6128/Midterm Practice/Charity 5K - Model Answer.docx
@@ -73,6 +73,27 @@
           <w:sz w:val="19"/>
           <w:szCs w:val="19"/>
         </w:rPr>
+        <w:t xml:space="preserve">AI use:</w:t>
+      </w:r>
+      <w:r>
+        <w:rPr>
+          <w:sz w:val="19"/>
+          <w:szCs w:val="19"/>
+        </w:rPr>
+        <w:t xml:space="preserve"> this practice case and model answer were generated with an AI assistant. See the AI use disclosure at the end of the document.</w:t>
+      </w:r>
+    </w:p>
+    <w:p>
+      <w:pPr>
+        <w:spacing w:after="120"/>
+      </w:pPr>
+      <w:r>
+        <w:rPr>
+          <w:b/>
+          <w:bCs/>
+          <w:sz w:val="19"/>
+          <w:szCs w:val="19"/>
+        </w:rPr>
         <w:t xml:space="preserve">Companion file:</w:t>
       </w:r>
       <w:r>
@@ -406,7 +427,7 @@
                 <w:sz w:val="19"/>
                 <w:szCs w:val="19"/>
               </w:rPr>
-              <w:t xml:space="preserve">61 working days (about 3 months). Standard Monday–Friday calendar, 8:00–17:00, with Family Day (Mon Feb 15) and Good Friday (Fri Mar 26) set as non-working days.</w:t>
+              <w:t xml:space="preserve">61 working days (about 3 months). Standard Monday–Friday calendar, 8:00–17:00, with Family Day (Mon Feb 15) and Good Friday (Fri Mar 26) set as non-working days (Government of Ontario, n.d.).</w:t>
             </w:r>
           </w:p>
         </w:tc>
@@ -1464,7 +1485,7 @@
         <w:t xml:space="preserve">WBS</w:t>
       </w:r>
       <w:r>
-        <w:t xml:space="preserve"> column is inserted as the first column of the Entry table (right-click the first column heading → Insert Column → WBS).</w:t>
+        <w:t xml:space="preserve"> column is inserted as the first column of the Entry table (right-click the first column heading → Insert Column → WBS; Microsoft, n.d.-b).</w:t>
       </w:r>
     </w:p>
     <w:p>
@@ -3389,7 +3410,7 @@
         <w:t xml:space="preserve">Critical Tasks</w:t>
       </w:r>
       <w:r>
-        <w:t xml:space="preserve"> on the Format tab. It runs for 61 working days, unbroken from the kickoff to project close:</w:t>
+        <w:t xml:space="preserve"> on the Format tab (Microsoft, n.d.-c). It runs for 61 working days, unbroken from the kickoff to project close:</w:t>
       </w:r>
     </w:p>
     <w:p>
@@ -8398,7 +8419,7 @@
           <w:sz w:val="18"/>
           <w:szCs w:val="18"/>
         </w:rPr>
-        <w:t xml:space="preserve">Figure 2. Power/interest grid. The two most challenging stakeholders are ringed in red.</w:t>
+        <w:t xml:space="preserve">Figure 2. Power/interest grid, after PMI (2017). The two most challenging stakeholders are ringed in red.</w:t>
       </w:r>
     </w:p>
     <w:p>
@@ -8562,7 +8583,7 @@
         <w:spacing w:after="120"/>
       </w:pPr>
       <w:r>
-        <w:t xml:space="preserve">Both plans follow the same structure: a goal, a named owner, a target engagement level, and a schedule of communications. Each communication is tagged with the PMBOK method it uses (push, pull or interactive), its format and its timing, and each plan ends with feedback and escalation routes.</w:t>
+        <w:t xml:space="preserve">Both plans follow the same structure: a goal, a named owner, a target engagement level, and a schedule of communications. Each communication is tagged with the communication method it uses (push, pull or interactive; PMI, 2017), its format and its timing, and each plan ends with feedback and escalation routes.</w:t>
       </w:r>
     </w:p>
     <w:p>
@@ -9138,7 +9159,7 @@
           <w:sz w:val="18"/>
           <w:szCs w:val="18"/>
         </w:rPr>
-        <w:t xml:space="preserve">C = current engagement, D = desired engagement.</w:t>
+        <w:t xml:space="preserve">C = current engagement, D = desired engagement. Format follows the stakeholder engagement assessment matrix in PMI (2017).</w:t>
       </w:r>
     </w:p>
     <w:p>
@@ -12096,6 +12117,166 @@
       </w:pPr>
       <w:r>
         <w:t xml:space="preserve">Predecessors in MS Project are entered by row ID, not by WBS code. For example, Registration opens (ID 22) has predecessors 21,31,16, and the team challenge (ID 33) has 32SS+5d.</w:t>
+      </w:r>
+    </w:p>
+    <w:p>
+      <w:pPr>
+        <w:spacing w:after="120"/>
+      </w:pPr>
+      <w:r>
+        <w:t xml:space="preserve">If a case asks for regular status updates, add them as a recurring task with Task → Task ▾ → Recurring Task, assigned to the PM (Microsoft, n.d.-a). Leave the occurrences unlinked, because their dates drive them.</w:t>
+      </w:r>
+    </w:p>
+    <w:p>
+      <w:pPr>
+        <w:pStyle w:val="Heading1"/>
+      </w:pPr>
+      <w:r>
+        <w:t xml:space="preserve">References</w:t>
+      </w:r>
+    </w:p>
+    <w:p>
+      <w:pPr>
+        <w:spacing w:after="120"/>
+        <w:ind w:left="720" w:hanging="720"/>
+      </w:pPr>
+      <w:r>
+        <w:t xml:space="preserve">Government of Ontario. (n.d.). Public holidays. In </w:t>
+      </w:r>
+      <w:r>
+        <w:rPr>
+          <w:i/>
+          <w:iCs/>
+        </w:rPr>
+        <w:t xml:space="preserve">Your guide to the Employment Standards Act</w:t>
+      </w:r>
+      <w:r>
+        <w:t xml:space="preserve">. Retrieved October 23, 2026, from https://www.ontario.ca/document/your-guide-employment-standards-act-0/public-holidays</w:t>
+      </w:r>
+    </w:p>
+    <w:p>
+      <w:pPr>
+        <w:spacing w:after="120"/>
+        <w:ind w:left="720" w:hanging="720"/>
+      </w:pPr>
+      <w:r>
+        <w:t xml:space="preserve">Microsoft. (n.d.-a). </w:t>
+      </w:r>
+      <w:r>
+        <w:rPr>
+          <w:i/>
+          <w:iCs/>
+        </w:rPr>
+        <w:t xml:space="preserve">Create recurring tasks</w:t>
+      </w:r>
+      <w:r>
+        <w:t xml:space="preserve">. Microsoft Support. Retrieved October 23, 2026, from https://support.microsoft.com/en-us/project/create-recurring-tasks</w:t>
+      </w:r>
+    </w:p>
+    <w:p>
+      <w:pPr>
+        <w:spacing w:after="120"/>
+        <w:ind w:left="720" w:hanging="720"/>
+      </w:pPr>
+      <w:r>
+        <w:t xml:space="preserve">Microsoft. (n.d.-b). </w:t>
+      </w:r>
+      <w:r>
+        <w:rPr>
+          <w:i/>
+          <w:iCs/>
+        </w:rPr>
+        <w:t xml:space="preserve">Create WBS codes in Project desktop</w:t>
+      </w:r>
+      <w:r>
+        <w:t xml:space="preserve">. Microsoft Support. Retrieved October 23, 2026, from https://support.microsoft.com/en-us/project/create-wbs-codes-in-project-desktop</w:t>
+      </w:r>
+    </w:p>
+    <w:p>
+      <w:pPr>
+        <w:spacing w:after="120"/>
+        <w:ind w:left="720" w:hanging="720"/>
+      </w:pPr>
+      <w:r>
+        <w:t xml:space="preserve">Microsoft. (n.d.-c). </w:t>
+      </w:r>
+      <w:r>
+        <w:rPr>
+          <w:i/>
+          <w:iCs/>
+        </w:rPr>
+        <w:t xml:space="preserve">Show the critical path of your project in Project</w:t>
+      </w:r>
+      <w:r>
+        <w:t xml:space="preserve">. Microsoft Support. Retrieved October 23, 2026, from https://support.microsoft.com/en-us/office/show-the-critical-path-of-your-project-in-project-ad6e3b08-7748-4231-afc4-a2046207fd86</w:t>
+      </w:r>
+    </w:p>
+    <w:p>
+      <w:pPr>
+        <w:spacing w:after="120"/>
+        <w:ind w:left="720" w:hanging="720"/>
+      </w:pPr>
+      <w:r>
+        <w:t xml:space="preserve">Project Management Institute. (2017). </w:t>
+      </w:r>
+      <w:r>
+        <w:rPr>
+          <w:i/>
+          <w:iCs/>
+        </w:rPr>
+        <w:t xml:space="preserve">A guide to the project management body of knowledge (PMBOK guide)</w:t>
+      </w:r>
+      <w:r>
+        <w:t xml:space="preserve"> (6th ed.). Project Management Institute. ISBN 978-1-62825-184-5. Chapter 10 (Project Communications Management) and Chapter 13 (Project Stakeholder Management).</w:t>
+      </w:r>
+    </w:p>
+    <w:p>
+      <w:pPr>
+        <w:spacing w:after="120" w:before="120"/>
+      </w:pPr>
+      <w:r>
+        <w:rPr>
+          <w:color w:val="59656F"/>
+          <w:sz w:val="19"/>
+          <w:szCs w:val="19"/>
+        </w:rPr>
+        <w:t xml:space="preserve">The case, its organizations and all figures are fictional, so no source is cited for them.</w:t>
+      </w:r>
+    </w:p>
+    <w:p>
+      <w:pPr>
+        <w:pStyle w:val="Heading1"/>
+      </w:pPr>
+      <w:r>
+        <w:t xml:space="preserve">AI use disclosure</w:t>
+      </w:r>
+    </w:p>
+    <w:p>
+      <w:pPr>
+        <w:spacing w:after="120"/>
+      </w:pPr>
+      <w:r>
+        <w:t xml:space="preserve">This practice case and model answer were generated with Claude, an AI assistant made by Anthropic, at a student’s request, as revision material for the MGMT 6128 midterm. AI was used for far more than editing. It wrote the case, built the schedule, resource plan and stakeholder answers, drew the figures, and produced this document and the MS Project file.</w:t>
+      </w:r>
+    </w:p>
+    <w:p>
+      <w:pPr>
+        <w:spacing w:after="120"/>
+      </w:pPr>
+      <w:r>
+        <w:t xml:space="preserve">The references above were checked against the live sources on October 23, 2026. They support the MS Project techniques, the holiday dates and the stakeholder and communication frameworks. They are not the source of the case content.</w:t>
+      </w:r>
+    </w:p>
+    <w:p>
+      <w:pPr>
+        <w:spacing w:after="120"/>
+      </w:pPr>
+      <w:r>
+        <w:rPr>
+          <w:b/>
+          <w:bCs/>
+        </w:rPr>
+        <w:t xml:space="preserve">This document is not a student’s own work. It must not be submitted, in whole or in part, for any graded assessment. The MGMT 6128 course policy does not allow AI to create assignments, and it prohibits AI use in any way on quizzes and exams.</w:t>
       </w:r>
     </w:p>
     <w:p>

</xml_diff>